<commit_message>
fix spacing and names
</commit_message>
<xml_diff>
--- a/การเขียนเรียงความขั้นสูง.docx
+++ b/การเขียนเรียงความขั้นสูง.docx
@@ -457,17 +457,7 @@
           <w:szCs w:val="32"/>
           <w:cs/>
         </w:rPr>
-        <w:t>นายกฤษฎ์ติกุณ    วงษ์นิล</w:t>
-      </w:r>
-      <w:r>
-        <w:rPr>
-          <w:rFonts w:ascii="TH Sarabun New" w:hAnsi="TH Sarabun New" w:cs="TH Sarabun New"/>
-          <w:noProof w:val="0"/>
-          <w:sz w:val="32"/>
-          <w:szCs w:val="32"/>
-          <w:cs/>
-        </w:rPr>
-        <w:tab/>
+        <w:t>นายกฤษฎ์ติกุณ</w:t>
       </w:r>
       <w:r>
         <w:rPr>
@@ -477,6 +467,36 @@
           <w:szCs w:val="32"/>
           <w:cs/>
         </w:rPr>
+        <w:t xml:space="preserve">      </w:t>
+      </w:r>
+      <w:r>
+        <w:rPr>
+          <w:rFonts w:ascii="TH Sarabun New" w:hAnsi="TH Sarabun New" w:cs="TH Sarabun New" w:hint="cs"/>
+          <w:noProof w:val="0"/>
+          <w:sz w:val="32"/>
+          <w:szCs w:val="32"/>
+          <w:cs/>
+        </w:rPr>
+        <w:t>วงษ์นิล</w:t>
+      </w:r>
+      <w:r>
+        <w:rPr>
+          <w:rFonts w:ascii="TH Sarabun New" w:hAnsi="TH Sarabun New" w:cs="TH Sarabun New"/>
+          <w:noProof w:val="0"/>
+          <w:sz w:val="32"/>
+          <w:szCs w:val="32"/>
+          <w:cs/>
+        </w:rPr>
+        <w:tab/>
+      </w:r>
+      <w:r>
+        <w:rPr>
+          <w:rFonts w:ascii="TH Sarabun New" w:hAnsi="TH Sarabun New" w:cs="TH Sarabun New" w:hint="cs"/>
+          <w:noProof w:val="0"/>
+          <w:sz w:val="32"/>
+          <w:szCs w:val="32"/>
+          <w:cs/>
+        </w:rPr>
         <w:t xml:space="preserve">เลขที่ </w:t>
       </w:r>
       <w:r>
@@ -530,7 +550,7 @@
           <w:szCs w:val="32"/>
           <w:cs/>
         </w:rPr>
-        <w:t xml:space="preserve">   </w:t>
+        <w:t xml:space="preserve">      </w:t>
       </w:r>
       <w:r>
         <w:rPr>
@@ -540,7 +560,7 @@
           <w:szCs w:val="32"/>
           <w:cs/>
         </w:rPr>
-        <w:t xml:space="preserve"> ลี้กุล</w:t>
+        <w:t>ลี้กุล</w:t>
       </w:r>
       <w:r>
         <w:rPr>
@@ -595,7 +615,7 @@
           <w:cs/>
         </w:rPr>
         <w:tab/>
-        <w:t xml:space="preserve">นายณัฐชนน </w:t>
+        <w:t>นายณัฐชนน</w:t>
       </w:r>
       <w:r>
         <w:rPr>
@@ -605,7 +625,7 @@
           <w:szCs w:val="32"/>
           <w:cs/>
         </w:rPr>
-        <w:t xml:space="preserve">   </w:t>
+        <w:t xml:space="preserve">      </w:t>
       </w:r>
       <w:r>
         <w:rPr>
@@ -670,7 +690,7 @@
           <w:cs/>
         </w:rPr>
         <w:tab/>
-        <w:t xml:space="preserve">นายบวรวิชญ์ </w:t>
+        <w:t>นายบวรวิชญ์</w:t>
       </w:r>
       <w:r>
         <w:rPr>
@@ -680,7 +700,7 @@
           <w:szCs w:val="32"/>
           <w:cs/>
         </w:rPr>
-        <w:t xml:space="preserve">   </w:t>
+        <w:t xml:space="preserve">      </w:t>
       </w:r>
       <w:r>
         <w:rPr>
@@ -772,7 +792,7 @@
           <w:szCs w:val="32"/>
           <w:cs/>
         </w:rPr>
-        <w:t xml:space="preserve">   </w:t>
+        <w:t xml:space="preserve">      </w:t>
       </w:r>
       <w:r>
         <w:rPr>
@@ -782,7 +802,7 @@
           <w:szCs w:val="32"/>
           <w:cs/>
         </w:rPr>
-        <w:t xml:space="preserve"> เกษมพิณ</w:t>
+        <w:t>เกษมพิณ</w:t>
       </w:r>
       <w:r>
         <w:rPr>
@@ -910,57 +930,22 @@
         <w:spacing w:after="0" w:line="240" w:lineRule="auto"/>
         <w:jc w:val="center"/>
         <w:rPr>
-          <w:rFonts w:ascii="TH Sarabun New" w:hAnsi="TH Sarabun New" w:cs="TH Sarabun New"/>
-          <w:noProof w:val="0"/>
-          <w:sz w:val="32"/>
-          <w:szCs w:val="32"/>
-        </w:rPr>
-      </w:pPr>
-      <w:r>
-        <w:rPr>
-          <w:rFonts w:ascii="TH Sarabun New" w:hAnsi="TH Sarabun New" w:cs="TH Sarabun New"/>
-          <w:noProof w:val="0"/>
-          <w:sz w:val="32"/>
-          <w:szCs w:val="32"/>
-          <w:cs/>
-        </w:rPr>
-        <w:t xml:space="preserve">มิสพรทิพย์ </w:t>
-      </w:r>
-      <w:r>
-        <w:rPr>
           <w:rFonts w:ascii="TH Sarabun New" w:hAnsi="TH Sarabun New" w:cs="TH Sarabun New" w:hint="cs"/>
           <w:noProof w:val="0"/>
           <w:sz w:val="32"/>
           <w:szCs w:val="32"/>
           <w:cs/>
         </w:rPr>
-        <w:t xml:space="preserve">   สังเกต</w:t>
-      </w:r>
-    </w:p>
-    <w:p>
-      <w:pPr>
-        <w:tabs>
-          <w:tab w:val="left" w:pos="1440"/>
-          <w:tab w:val="left" w:pos="5490"/>
-        </w:tabs>
-        <w:spacing w:after="0" w:line="240" w:lineRule="auto"/>
-        <w:jc w:val="center"/>
+      </w:pPr>
+      <w:r>
         <w:rPr>
           <w:rFonts w:ascii="TH Sarabun New" w:hAnsi="TH Sarabun New" w:cs="TH Sarabun New"/>
           <w:noProof w:val="0"/>
           <w:sz w:val="32"/>
           <w:szCs w:val="32"/>
-        </w:rPr>
-      </w:pPr>
-      <w:r>
-        <w:rPr>
-          <w:rFonts w:ascii="TH Sarabun New" w:hAnsi="TH Sarabun New" w:cs="TH Sarabun New"/>
-          <w:noProof w:val="0"/>
-          <w:sz w:val="32"/>
-          <w:szCs w:val="32"/>
-          <w:cs/>
-        </w:rPr>
-        <w:t>มิสสุภาณี</w:t>
+          <w:cs/>
+        </w:rPr>
+        <w:t>มิสพรทิพย์</w:t>
       </w:r>
       <w:r>
         <w:rPr>
@@ -970,43 +955,7 @@
           <w:szCs w:val="32"/>
           <w:cs/>
         </w:rPr>
-        <w:t xml:space="preserve">   </w:t>
-      </w:r>
-      <w:r>
-        <w:rPr>
-          <w:rFonts w:ascii="TH Sarabun New" w:hAnsi="TH Sarabun New" w:cs="TH Sarabun New"/>
-          <w:noProof w:val="0"/>
-          <w:sz w:val="32"/>
-          <w:szCs w:val="32"/>
-          <w:cs/>
-        </w:rPr>
-        <w:t xml:space="preserve"> สุภาพ</w:t>
-      </w:r>
-    </w:p>
-    <w:p>
-      <w:pPr>
-        <w:tabs>
-          <w:tab w:val="left" w:pos="1440"/>
-          <w:tab w:val="left" w:pos="5490"/>
-        </w:tabs>
-        <w:spacing w:after="0" w:line="240" w:lineRule="auto"/>
-        <w:jc w:val="center"/>
-        <w:rPr>
-          <w:rFonts w:ascii="TH Sarabun New" w:hAnsi="TH Sarabun New" w:cs="TH Sarabun New"/>
-          <w:noProof w:val="0"/>
-          <w:sz w:val="32"/>
-          <w:szCs w:val="32"/>
-        </w:rPr>
-      </w:pPr>
-      <w:r>
-        <w:rPr>
-          <w:rFonts w:ascii="TH Sarabun New" w:hAnsi="TH Sarabun New" w:cs="TH Sarabun New"/>
-          <w:noProof w:val="0"/>
-          <w:sz w:val="32"/>
-          <w:szCs w:val="32"/>
-          <w:cs/>
-        </w:rPr>
-        <w:t>มิสพัฒนี</w:t>
+        <w:t xml:space="preserve">      </w:t>
       </w:r>
       <w:r>
         <w:rPr>
@@ -1016,17 +965,109 @@
           <w:szCs w:val="32"/>
           <w:cs/>
         </w:rPr>
-        <w:t xml:space="preserve">   </w:t>
-      </w:r>
-      <w:r>
-        <w:rPr>
-          <w:rFonts w:ascii="TH Sarabun New" w:hAnsi="TH Sarabun New" w:cs="TH Sarabun New"/>
+        <w:t>สังเกต</w:t>
+      </w:r>
+      <w:r>
+        <w:rPr>
+          <w:rFonts w:ascii="TH Sarabun New" w:hAnsi="TH Sarabun New" w:cs="TH Sarabun New" w:hint="cs"/>
           <w:noProof w:val="0"/>
           <w:sz w:val="32"/>
           <w:szCs w:val="32"/>
           <w:cs/>
         </w:rPr>
-        <w:t xml:space="preserve"> สกุลช่างเสนาะ</w:t>
+        <w:t>ุ</w:t>
+      </w:r>
+    </w:p>
+    <w:p>
+      <w:pPr>
+        <w:tabs>
+          <w:tab w:val="left" w:pos="1440"/>
+          <w:tab w:val="left" w:pos="5490"/>
+        </w:tabs>
+        <w:spacing w:after="0" w:line="240" w:lineRule="auto"/>
+        <w:jc w:val="center"/>
+        <w:rPr>
+          <w:rFonts w:ascii="TH Sarabun New" w:hAnsi="TH Sarabun New" w:cs="TH Sarabun New"/>
+          <w:noProof w:val="0"/>
+          <w:sz w:val="32"/>
+          <w:szCs w:val="32"/>
+        </w:rPr>
+      </w:pPr>
+      <w:r>
+        <w:rPr>
+          <w:rFonts w:ascii="TH Sarabun New" w:hAnsi="TH Sarabun New" w:cs="TH Sarabun New"/>
+          <w:noProof w:val="0"/>
+          <w:sz w:val="32"/>
+          <w:szCs w:val="32"/>
+          <w:cs/>
+        </w:rPr>
+        <w:t>มิสสุภาณี</w:t>
+      </w:r>
+      <w:r>
+        <w:rPr>
+          <w:rFonts w:ascii="TH Sarabun New" w:hAnsi="TH Sarabun New" w:cs="TH Sarabun New" w:hint="cs"/>
+          <w:noProof w:val="0"/>
+          <w:sz w:val="32"/>
+          <w:szCs w:val="32"/>
+          <w:cs/>
+        </w:rPr>
+        <w:t xml:space="preserve">      </w:t>
+      </w:r>
+      <w:r>
+        <w:rPr>
+          <w:rFonts w:ascii="TH Sarabun New" w:hAnsi="TH Sarabun New" w:cs="TH Sarabun New"/>
+          <w:noProof w:val="0"/>
+          <w:sz w:val="32"/>
+          <w:szCs w:val="32"/>
+          <w:cs/>
+        </w:rPr>
+        <w:t>สุภาพ</w:t>
+      </w:r>
+    </w:p>
+    <w:p>
+      <w:pPr>
+        <w:tabs>
+          <w:tab w:val="left" w:pos="1440"/>
+          <w:tab w:val="left" w:pos="5490"/>
+        </w:tabs>
+        <w:spacing w:after="0" w:line="240" w:lineRule="auto"/>
+        <w:jc w:val="center"/>
+        <w:rPr>
+          <w:rFonts w:ascii="TH Sarabun New" w:hAnsi="TH Sarabun New" w:cs="TH Sarabun New"/>
+          <w:noProof w:val="0"/>
+          <w:sz w:val="32"/>
+          <w:szCs w:val="32"/>
+        </w:rPr>
+      </w:pPr>
+      <w:r>
+        <w:rPr>
+          <w:rFonts w:ascii="TH Sarabun New" w:hAnsi="TH Sarabun New" w:cs="TH Sarabun New"/>
+          <w:noProof w:val="0"/>
+          <w:sz w:val="32"/>
+          <w:szCs w:val="32"/>
+          <w:cs/>
+        </w:rPr>
+        <w:t>มิสพัฒนี</w:t>
+      </w:r>
+      <w:r>
+        <w:rPr>
+          <w:rFonts w:ascii="TH Sarabun New" w:hAnsi="TH Sarabun New" w:cs="TH Sarabun New" w:hint="cs"/>
+          <w:noProof w:val="0"/>
+          <w:sz w:val="32"/>
+          <w:szCs w:val="32"/>
+          <w:cs/>
+        </w:rPr>
+        <w:t xml:space="preserve">      </w:t>
+      </w:r>
+      <w:r>
+        <w:rPr>
+          <w:rFonts w:ascii="TH Sarabun New" w:hAnsi="TH Sarabun New" w:cs="TH Sarabun New"/>
+          <w:noProof w:val="0"/>
+          <w:sz w:val="32"/>
+          <w:szCs w:val="32"/>
+          <w:cs/>
+        </w:rPr>
+        <w:t>สกุลช่างเสนาะ</w:t>
       </w:r>
     </w:p>
     <w:p>

</xml_diff>